<commit_message>
Handover for the next account: memory export, doc builder, legal drafts rev 2 (30 Oct 2026)
Co-Authored-By: Claude Opus 5.5 <noreply@anthropic.com>
Claude-Session: https://claude.ai/code/session_01Bpzt23dnJQRXixhCLMoUgQ
</commit_message>
<xml_diff>
--- a/docs/legal/RemonLogic_MoA_Objects_Clause_Draft.docx
+++ b/docs/legal/RemonLogic_MoA_Objects_Clause_Draft.docx
@@ -1499,7 +1499,7 @@
         <w:rPr>
           <w:rFonts w:ascii="Aptos" w:cs="Aptos" w:eastAsia="Aptos" w:hAnsi="Aptos"/>
         </w:rPr>
-        <w:t xml:space="preserve"> To establish and operate online marketplaces, stores and exchanges, for the Company and for third parties, for the sale, licensing and distribution of digital goods and services, including software, applications, plug-ins, templates, themes, design assets, stock images, stock video, music, sound effects, fonts, three-dimensional models, prompts, consented voices and avatars, courses and e-books.</w:t>
+        <w:t xml:space="preserve"> To establish and operate online marketplaces, stores and exchanges, for the Company and for third parties, for the sale, licensing and distribution of digital goods and services, including software, applications, plug-ins, templates, themes, design assets, stock images, stock video, music, sound effects, fonts, three-dimensional models, prompts, licensed voice-artist and synthetic voices, stock presenters, characters and avatars (but never a person's own voice clone or digital twin), courses and e-books; with payment collected and payouts made only through licensed payment service providers.</w:t>
       </w:r>
     </w:p>
     <w:p>
@@ -1624,13 +1624,13 @@
           <w:b/>
           <w:bCs/>
         </w:rPr>
-        <w:t xml:space="preserve">Subscriptions, credits and vouchers.</w:t>
-      </w:r>
-      <w:r>
-        <w:rPr>
-          <w:rFonts w:ascii="Aptos" w:cs="Aptos" w:eastAsia="Aptos" w:hAnsi="Aptos"/>
-        </w:rPr>
-        <w:t xml:space="preserve"> To offer subscriptions, prepaid service plans, usage credits, vouchers, coupons, promotional codes, gift cards and reward or loyalty points, redeemable only for the Company's own goods and services, not convertible into cash and not transferable, subject to any approval of Bangladesh Bank or any other authority where the law requires it; the Company shall not hold customers' money as a stored balance or wallet (owner decision, 30 October 2026). [lawyer to confirm]</w:t>
+        <w:t xml:space="preserve">Subscriptions, plans and vouchers.</w:t>
+      </w:r>
+      <w:r>
+        <w:rPr>
+          <w:rFonts w:ascii="Aptos" w:cs="Aptos" w:eastAsia="Aptos" w:hAnsi="Aptos"/>
+        </w:rPr>
+        <w:t xml:space="preserve"> To offer subscriptions, service plans, vouchers and promotional codes for named plans or services, coupons, and reward or loyalty benefits given free of charge, redeemable only for the Company's own goods and services, not convertible into cash and not transferable; the Company shall not hold customers' money as a stored balance, wallet or credit in Taka or any currency, and any instrument that the law treats as a prepaid instrument shall be offered only with the approval of Bangladesh Bank (owner decision, 30 October 2026). [lawyer to confirm]</w:t>
       </w:r>
     </w:p>
     <w:p>
@@ -2615,7 +2615,7 @@
         <w:rPr>
           <w:rFonts w:ascii="Aptos" w:cs="Aptos" w:eastAsia="Aptos" w:hAnsi="Aptos"/>
         </w:rPr>
-        <w:t xml:space="preserve"> কোম্পানি ও তৃতীয় পক্ষের জন্য ডিজিটাল পণ্য ও সেবা বিক্রয়, লাইসেন্স প্রদান ও বিতরণের উদ্দেশ্যে অনলাইন মার্কেটপ্লেস, স্টোর ও বিনিময় প্ল্যাটফর্ম প্রতিষ্ঠা ও পরিচালনা করা; এর মধ্যে রয়েছে সফটওয়্যার, অ্যাপ্লিকেশন, প্লাগ-ইন, টেমপ্লেট, থিম, ডিজাইন উপকরণ, স্টক ছবি, স্টক ভিডিও, সংগীত, শব্দ-প্রভাব, ফন্ট, ত্রিমাত্রিক মডেল, প্রম্পট, সম্মতিপ্রাপ্ত কণ্ঠ ও অবতার, কোর্স এবং ই-বুক।</w:t>
+        <w:t xml:space="preserve"> কোম্পানি ও তৃতীয় পক্ষের জন্য ডিজিটাল পণ্য ও সেবা বিক্রয়, লাইসেন্স প্রদান ও বিতরণের উদ্দেশ্যে অনলাইন মার্কেটপ্লেস, স্টোর ও বিনিময় প্ল্যাটফর্ম প্রতিষ্ঠা ও পরিচালনা করা; এর মধ্যে রয়েছে সফটওয়্যার, অ্যাপ্লিকেশন, প্লাগ-ইন, টেমপ্লেট, থিম, ডিজাইন উপকরণ, স্টক ছবি, স্টক ভিডিও, সংগীত, শব্দ-প্রভাব, ফন্ট, ত্রিমাত্রিক মডেল, প্রম্পট, লাইসেন্সপ্রাপ্ত কণ্ঠশিল্পীর কণ্ঠ ও কৃত্রিম (সিনথেটিক) কণ্ঠ, স্টক উপস্থাপক, চরিত্র ও অবতার (তবে কোনো ব্যক্তির নিজস্ব কণ্ঠের ক্লোন বা ডিজিটাল টুইন কখনোই নয়), কোর্স এবং ই-বুক; এবং মূল্য সংগ্রহ ও বিক্রেতাদের অর্থ পরিশোধ কেবল লাইসেন্সপ্রাপ্ত পেমেন্ট সার্ভিস প্রোভাইডারের মাধ্যমে করা।</w:t>
       </w:r>
     </w:p>
     <w:p>
@@ -2740,13 +2740,13 @@
           <w:b/>
           <w:bCs/>
         </w:rPr>
-        <w:t xml:space="preserve">গ্রাহকত্ব, ক্রেডিট ও ভাউচার।</w:t>
-      </w:r>
-      <w:r>
-        <w:rPr>
-          <w:rFonts w:ascii="Aptos" w:cs="Aptos" w:eastAsia="Aptos" w:hAnsi="Aptos"/>
-        </w:rPr>
-        <w:t xml:space="preserve"> কেবল কোম্পানির নিজস্ব পণ্য ও সেবার বিপরীতে ব্যবহারযোগ্য, নগদে রূপান্তরযোগ্য নয় ও হস্তান্তরযোগ্য নয় এমন গ্রাহকত্ব (সাবস্ক্রিপশন), অগ্রিম পরিশোধিত সেবা-পরিকল্পনা, ব্যবহার-ক্রেডিট, ভাউচার, কুপন, প্রচারণা কোড, উপহার কার্ড এবং পুরস্কার বা আনুগত্য পয়েন্ট প্রদান করা; তবে আইন অনুযায়ী প্রয়োজন হলে বাংলাদেশ ব্যাংক বা অন্য কোনো কর্তৃপক্ষের অনুমোদন সাপেক্ষে; কোম্পানি গ্রাহকের অর্থ জমা ব্যালান্স বা ওয়ালেট হিসেবে রাখবে না।</w:t>
+        <w:t xml:space="preserve">গ্রাহকত্ব, প্ল্যান ও ভাউচার।</w:t>
+      </w:r>
+      <w:r>
+        <w:rPr>
+          <w:rFonts w:ascii="Aptos" w:cs="Aptos" w:eastAsia="Aptos" w:hAnsi="Aptos"/>
+        </w:rPr>
+        <w:t xml:space="preserve"> কেবল কোম্পানির নিজস্ব পণ্য ও সেবার বিপরীতে ব্যবহারযোগ্য, নগদে রূপান্তরযোগ্য নয় ও হস্তান্তরযোগ্য নয় এমন গ্রাহকত্ব (সাবস্ক্রিপশন), সেবা-প্ল্যান, নির্দিষ্ট প্ল্যান বা সেবার ভাউচার ও প্রচারণা কোড, কুপন এবং বিনামূল্যে প্রদত্ত পুরস্কার বা আনুগত্য সুবিধা প্রদান করা; কোম্পানি গ্রাহকের অর্থ টাকা বা অন্য কোনো মুদ্রায় জমা ব্যালান্স, ওয়ালেট বা ক্রেডিট হিসেবে রাখবে না, এবং আইন যে উপকরণকে প্রিপেইড ইনস্ট্রুমেন্ট হিসেবে গণ্য করে তা কেবল বাংলাদেশ ব্যাংকের অনুমোদনসাপেক্ষে প্রদান করা হবে।</w:t>
       </w:r>
     </w:p>
     <w:p>
@@ -5541,7 +5541,7 @@
         <w:rPr>
           <w:rFonts w:ascii="Aptos" w:cs="Aptos" w:eastAsia="Aptos" w:hAnsi="Aptos"/>
         </w:rPr>
-        <w:t xml:space="preserve"> the company will not hold customers' money as a stored balance or wallet; payment is taken per order or per plan. "Learning wallets" are removed from B.2. Gift cards and vouchers stay subject to Bangladesh Bank approval where required [lawyer to confirm].</w:t>
+        <w:t xml:space="preserve"> the company will not hold customers' money as a stored balance or wallet; payment is taken per order or per plan, and refunds go to the original payment method. "Learning wallets" are removed from B.2. No stored-value product is sold in Taka: credits, minute packs, gift vouchers (including NexaTute's Shikkha Salami), reseller packs and NexaLogicDev credits become named plan codes or per-order prices, not transferable and not exchangeable for cash; gift vouchers and minute packs stay off until the lawyer confirms the rules [lawyer to confirm; B.2 wording to be narrowed to match].</w:t>
       </w:r>
     </w:p>
     <w:p>
@@ -5565,7 +5565,7 @@
         <w:rPr>
           <w:rFonts w:ascii="Aptos" w:cs="Aptos" w:eastAsia="Aptos" w:hAnsi="Aptos"/>
         </w:rPr>
-        <w:t xml:space="preserve"> kept — one shared marketplace for NexaTute, Remon Motion Studio and NexaLogicDev, including other creators' digital goods, with payouts only through licensed providers.</w:t>
+        <w:t xml:space="preserve"> kept — one shared marketplace for NexaTute, Remon Motion Studio and NexaLogicDev, including other creators' digital goods (templates, stock media, voices designed by the company or recorded by paid voice artists, characters), with payment and payouts only through licensed providers. Personal voice clones and digital twins are never sold or listed (A.13 wording changed from "consented voices and avatars" on 30 October 2026). Users under 18 see only NexaTute learning items, with the guardian's approval for each purchase.</w:t>
       </w:r>
     </w:p>
     <w:p>
@@ -5589,7 +5589,7 @@
         <w:rPr>
           <w:rFonts w:ascii="Aptos" w:cs="Aptos" w:eastAsia="Aptos" w:hAnsi="Aptos"/>
         </w:rPr>
-        <w:t xml:space="preserve"> no call centre now, but it may come later, so it stays in the objects (only once licensed, C.2); support is AI first, then email to a person. Bulk SMS stays (through licensed providers).</w:t>
+        <w:t xml:space="preserve"> no call centre now, but it may come later, so it stays in the objects (only once licensed, C.2); support is AI first, then email to a person. Bulk SMS stays (through licensed providers): the company pays message charges within each package's allowance (up to 3 bulk sends a day and a recipient cap per package), and messages go out under the client's own sender name or WhatsApp number, with opt-out.</w:t>
       </w:r>
     </w:p>
     <w:p>

</xml_diff>